<commit_message>
Recommend a 17-catalyst campaign instead of asking the lab to choose
build_campaign.py splits the synthesis budget deliberately: 12 catalysts at the
model's optimum (18.33-18.79% predicted), where the expected hits are, plus 5
spanning the strongest alternative supports (Ti, La, Ca, Mg, Si) as an
information purchase rather than a yield purchase. 78% of the lab's existing top
decile contains Ba, so the model's Ba preference may partly reflect that
coverage; if tier-B catalysts outperform their predictions, that is diagnostic
in a way twenty Ba/Mo variants cannot be.

Expected hit rate for tier A is quoted from the retrospective grouped-CV
precision@20 interval (0.15-0.65, so roughly 2-8 of the 12) rather than a point
estimate. Note the per-support winners come from the candidates JSON, not the
CSV -- the CSV holds only the top 500 rows and all of them are Ba-supported.

Worknote and README updated to recommend the split; PDF/DOCX re-rendered.
</commit_message>
<xml_diff>
--- a/ocm_worknote_taniike.docx
+++ b/ocm_worknote_taniike.docx
@@ -3081,297 +3081,45 @@
         <w:pStyle w:val="BodyText"/>
       </w:pPr>
       <w:r>
-        <w:t xml:space="preserve">Whether a campaign should concentrate on the Ba/Mo optimum or spread across supports is a judgement</w:t>
-      </w:r>
-      <w:r>
-        <w:t xml:space="preserve"> </w:t>
-      </w:r>
-      <w:r>
-        <w:t xml:space="preserve">we would rather leave to the laboratory: twenty near-identical catalysts test one hypothesis twenty</w:t>
-      </w:r>
-      <w:r>
-        <w:t xml:space="preserve"> </w:t>
-      </w:r>
-      <w:r>
-        <w:t xml:space="preserve">times, but the alternative sacrifices predicted yield.</w:t>
-      </w:r>
-    </w:p>
-    <w:bookmarkEnd w:id="44"/>
-    <w:bookmarkStart w:id="45" w:name="relation-to-prior-work"/>
-    <w:p>
-      <w:pPr>
-        <w:pStyle w:val="Heading2"/>
-      </w:pPr>
-      <w:r>
-        <w:t xml:space="preserve">9. Relation to prior work</w:t>
-      </w:r>
-    </w:p>
-    <w:p>
-      <w:pPr>
-        <w:pStyle w:val="FirstParagraph"/>
-      </w:pPr>
-      <w:r>
-        <w:t xml:space="preserve">The mechanism of PFT — using a model’s prediction as an input feature — is</w:t>
-      </w:r>
-      <w:r>
-        <w:t xml:space="preserve"> </w:t>
-      </w:r>
-      <w:r>
-        <w:rPr>
-          <w:b/>
-          <w:bCs/>
-        </w:rPr>
-        <w:t xml:space="preserve">stacked generalisation</w:t>
-      </w:r>
-      <w:r>
-        <w:t xml:space="preserve"> </w:t>
-      </w:r>
-      <w:r>
-        <w:t xml:space="preserve">(Wolpert,</w:t>
-      </w:r>
-      <w:r>
-        <w:t xml:space="preserve"> </w:t>
-      </w:r>
-      <w:r>
-        <w:rPr>
-          <w:i/>
-          <w:iCs/>
-        </w:rPr>
-        <w:t xml:space="preserve">Neural Networks</w:t>
-      </w:r>
-      <w:r>
-        <w:t xml:space="preserve"> </w:t>
-      </w:r>
-      <w:r>
-        <w:t xml:space="preserve">5, 1992, 241–259) applied across distributions.</w:t>
-      </w:r>
-      <w:r>
-        <w:t xml:space="preserve"> </w:t>
-      </w:r>
-      <w:r>
-        <w:t xml:space="preserve">“Prior Feature Transfer”</w:t>
-      </w:r>
-      <w:r>
-        <w:t xml:space="preserve"> </w:t>
-      </w:r>
-      <w:r>
-        <w:t xml:space="preserve">was our internal shorthand, not a standard term, and we note that</w:t>
-      </w:r>
-      <w:r>
-        <w:t xml:space="preserve"> </w:t>
-      </w:r>
-      <w:r>
-        <w:t xml:space="preserve">“feature transfer”</w:t>
-      </w:r>
-      <w:r>
-        <w:t xml:space="preserve"> </w:t>
-      </w:r>
-      <w:r>
-        <w:t xml:space="preserve">usually denotes</w:t>
-      </w:r>
-      <w:r>
-        <w:t xml:space="preserve"> </w:t>
-      </w:r>
-      <w:r>
-        <w:rPr>
-          <w:i/>
-          <w:iCs/>
-        </w:rPr>
-        <w:t xml:space="preserve">representation</w:t>
-      </w:r>
-      <w:r>
-        <w:t xml:space="preserve"> </w:t>
-      </w:r>
-      <w:r>
-        <w:t xml:space="preserve">transfer, which this is not.</w:t>
-      </w:r>
-    </w:p>
-    <w:p>
-      <w:pPr>
-        <w:pStyle w:val="BodyText"/>
-      </w:pPr>
-      <w:r>
-        <w:rPr>
-          <w:b/>
-          <w:bCs/>
-        </w:rPr>
-        <w:t xml:space="preserve">Our corrected understanding of when such a method can help.</w:t>
-      </w:r>
-      <w:r>
-        <w:t xml:space="preserve"> </w:t>
-      </w:r>
-      <w:r>
-        <w:t xml:space="preserve">Because the prior</w:t>
-      </w:r>
-      <w:r>
+        <w:rPr>
+          <w:b/>
+          <w:bCs/>
+        </w:rPr>
+        <w:t xml:space="preserve">Our recommended campaign (17 catalysts,</w:t>
+      </w:r>
+      <w:r>
+        <w:rPr>
+          <w:b/>
+          <w:bCs/>
+        </w:rPr>
         <w:t xml:space="preserve"> </w:t>
       </w:r>
       <w:r>
         <w:rPr>
           <w:rStyle w:val="VerbatimChar"/>
-        </w:rPr>
-        <w:t xml:space="preserve">p = f(x)</w:t>
-      </w:r>
-      <w:r>
-        <w:t xml:space="preserve"> </w:t>
-      </w:r>
-      <w:r>
-        <w:t xml:space="preserve">is a</w:t>
-      </w:r>
-      <w:r>
-        <w:t xml:space="preserve"> </w:t>
-      </w:r>
-      <w:r>
-        <w:t xml:space="preserve">deterministic function of features the final model already has,</w:t>
-      </w:r>
-      <w:r>
-        <w:t xml:space="preserve"> </w:t>
-      </w:r>
-      <w:r>
-        <w:rPr>
-          <w:rStyle w:val="VerbatimChar"/>
-        </w:rPr>
-        <w:t xml:space="preserve">I(y; x, f(x)) = I(y; x)</w:t>
-      </w:r>
-      <w:r>
-        <w:t xml:space="preserve"> </w:t>
-      </w:r>
-      <w:r>
-        <w:t xml:space="preserve">— it cannot</w:t>
-      </w:r>
-      <w:r>
-        <w:t xml:space="preserve"> </w:t>
-      </w:r>
-      <w:r>
-        <w:t xml:space="preserve">add information. It can only supply an inductive bias, or exploit source data covering regions the</w:t>
-      </w:r>
-      <w:r>
-        <w:t xml:space="preserve"> </w:t>
-      </w:r>
-      <w:r>
-        <w:t xml:space="preserve">target data does not. Our results indicate neither applies here at the scale that matters, for three</w:t>
-      </w:r>
-      <w:r>
-        <w:t xml:space="preserve"> </w:t>
-      </w:r>
-      <w:r>
-        <w:t xml:space="preserve">reasons: ~78.5 % of the literature is out-of-distribution relative to the lab; quantile normalisation</w:t>
-      </w:r>
-      <w:r>
-        <w:t xml:space="preserve"> </w:t>
-      </w:r>
-      <w:r>
-        <w:t xml:space="preserve">aligns marginal but not conditional distributions; and literature yields are measured under each</w:t>
-      </w:r>
-      <w:r>
-        <w:t xml:space="preserve"> </w:t>
-      </w:r>
-      <w:r>
-        <w:t xml:space="preserve">paper’s own conditions, whereas our target is the maximum over a standardised battery — semantically</w:t>
-      </w:r>
-      <w:r>
-        <w:t xml:space="preserve"> </w:t>
-      </w:r>
-      <w:r>
-        <w:t xml:space="preserve">different quantities.</w:t>
-      </w:r>
-      <w:r>
-        <w:t xml:space="preserve"> </w:t>
-      </w:r>
-      <w:r>
-        <w:rPr>
-          <w:b/>
-          <w:bCs/>
-        </w:rPr>
-        <w:t xml:space="preserve">The honest scope statement is that this family of methods is a local-coverage</w:t>
-      </w:r>
-      <w:r>
-        <w:rPr>
-          <w:b/>
-          <w:bCs/>
-        </w:rPr>
-        <w:t xml:space="preserve"> </w:t>
-      </w:r>
-      <w:r>
-        <w:rPr>
-          <w:b/>
-          <w:bCs/>
-        </w:rPr>
-        <w:t xml:space="preserve">tool, not a global-information tool.</w:t>
-      </w:r>
-    </w:p>
-    <w:p>
-      <w:pPr>
-        <w:pStyle w:val="BodyText"/>
-      </w:pPr>
-      <w:r>
-        <w:t xml:space="preserve">Related approaches remain distinct: Δ-machine-learning (Ramakrishnan et al.,</w:t>
-      </w:r>
-      <w:r>
-        <w:t xml:space="preserve"> </w:t>
-      </w:r>
-      <w:r>
-        <w:rPr>
-          <w:i/>
-          <w:iCs/>
-        </w:rPr>
-        <w:t xml:space="preserve">JCTC</w:t>
-      </w:r>
-      <w:r>
-        <w:t xml:space="preserve"> </w:t>
-      </w:r>
-      <w:r>
-        <w:t xml:space="preserve">11, 2015, 2087)</w:t>
-      </w:r>
-      <w:r>
-        <w:t xml:space="preserve"> </w:t>
-      </w:r>
-      <w:r>
-        <w:t xml:space="preserve">adds a source estimate as an additive baseline, inheriting its scale; importance weighting (Huang et</w:t>
-      </w:r>
-      <w:r>
-        <w:t xml:space="preserve"> </w:t>
-      </w:r>
-      <w:r>
-        <w:t xml:space="preserve">al., NIPS 2006; Sugiyama et al.,</w:t>
-      </w:r>
-      <w:r>
-        <w:t xml:space="preserve"> </w:t>
-      </w:r>
-      <w:r>
-        <w:rPr>
-          <w:i/>
-          <w:iCs/>
-        </w:rPr>
-        <w:t xml:space="preserve">JMLR</w:t>
-      </w:r>
-      <w:r>
-        <w:t xml:space="preserve"> </w:t>
-      </w:r>
-      <w:r>
-        <w:t xml:space="preserve">8, 2007) corrects which records are used but keeps source</w:t>
-      </w:r>
-      <w:r>
-        <w:t xml:space="preserve"> </w:t>
-      </w:r>
-      <w:r>
-        <w:t xml:space="preserve">labels in the objective — our DRST and KMM baselines are instances; label-shift correction (Lipton et</w:t>
-      </w:r>
-      <w:r>
-        <w:t xml:space="preserve"> </w:t>
-      </w:r>
-      <w:r>
-        <w:t xml:space="preserve">al., ICML 2018) reweights to correct the label distribution.</w:t>
-      </w:r>
-    </w:p>
-    <w:bookmarkEnd w:id="45"/>
-    <w:bookmarkStart w:id="46" w:name="limitations-and-next-steps"/>
-    <w:p>
-      <w:pPr>
-        <w:pStyle w:val="Heading2"/>
-      </w:pPr>
-      <w:r>
-        <w:t xml:space="preserve">10. Limitations and next steps</w:t>
+          <w:b/>
+          <w:bCs/>
+        </w:rPr>
+        <w:t xml:space="preserve">campaign_shortlist.csv</w:t>
+      </w:r>
+      <w:r>
+        <w:rPr>
+          <w:b/>
+          <w:bCs/>
+        </w:rPr>
+        <w:t xml:space="preserve">).</w:t>
+      </w:r>
+      <w:r>
+        <w:t xml:space="preserve"> </w:t>
+      </w:r>
+      <w:r>
+        <w:t xml:space="preserve">Rather than submit twenty</w:t>
+      </w:r>
+      <w:r>
+        <w:t xml:space="preserve"> </w:t>
+      </w:r>
+      <w:r>
+        <w:t xml:space="preserve">near-identical catalysts, we suggest splitting the budget:</w:t>
       </w:r>
     </w:p>
     <w:p>
@@ -3387,19 +3135,35 @@
           <w:b/>
           <w:bCs/>
         </w:rPr>
-        <w:t xml:space="preserve">The literature contribution is not demonstrated.</w:t>
-      </w:r>
-      <w:r>
-        <w:t xml:space="preserve"> </w:t>
-      </w:r>
-      <w:r>
-        <w:t xml:space="preserve">Four designs plus a 28-family follow-up all</w:t>
-      </w:r>
-      <w:r>
-        <w:t xml:space="preserve"> </w:t>
-      </w:r>
-      <w:r>
-        <w:t xml:space="preserve">returned null. We report this rather than continue searching for a variant that scores well.</w:t>
+        <w:t xml:space="preserve">Tier A — 12 catalysts, the model’s optimum</w:t>
+      </w:r>
+      <w:r>
+        <w:t xml:space="preserve"> </w:t>
+      </w:r>
+      <w:r>
+        <w:t xml:space="preserve">(predicted 18.33–18.79 %). This is where the expected</w:t>
+      </w:r>
+      <w:r>
+        <w:t xml:space="preserve"> </w:t>
+      </w:r>
+      <w:r>
+        <w:t xml:space="preserve">hits are. From the retrospective grouped-CV precision@20, we would expect roughly</w:t>
+      </w:r>
+      <w:r>
+        <w:t xml:space="preserve"> </w:t>
+      </w:r>
+      <w:r>
+        <w:rPr>
+          <w:b/>
+          <w:bCs/>
+        </w:rPr>
+        <w:t xml:space="preserve">2–8 of the 12</w:t>
+      </w:r>
+      <w:r>
+        <w:t xml:space="preserve"> </w:t>
+      </w:r>
+      <w:r>
+        <w:t xml:space="preserve">to be genuine top-decile performers (95 % CI 0.15–0.65 — deliberately a wide interval).</w:t>
       </w:r>
     </w:p>
     <w:p>
@@ -3415,19 +3179,339 @@
           <w:b/>
           <w:bCs/>
         </w:rPr>
-        <w:t xml:space="preserve">Novel promoter families cannot be priced.</w:t>
-      </w:r>
-      <w:r>
-        <w:t xml:space="preserve"> </w:t>
-      </w:r>
-      <w:r>
-        <w:t xml:space="preserve">This is structural, not a modelling deficiency — but</w:t>
-      </w:r>
-      <w:r>
-        <w:t xml:space="preserve"> </w:t>
-      </w:r>
-      <w:r>
-        <w:t xml:space="preserve">§7 quantifies the data required to remove the limitation.</w:t>
+        <w:t xml:space="preserve">Tier B — 5 catalysts, one per alternative support</w:t>
+      </w:r>
+      <w:r>
+        <w:t xml:space="preserve"> </w:t>
+      </w:r>
+      <w:r>
+        <w:t xml:space="preserve">(Ti 16.49, La 15.82, Ca 15.54, Mg 14.66,</w:t>
+      </w:r>
+      <w:r>
+        <w:t xml:space="preserve"> </w:t>
+      </w:r>
+      <w:r>
+        <w:t xml:space="preserve">Si 13.83). These cost predicted yield and we do not expect them to win. They are an</w:t>
+      </w:r>
+      <w:r>
+        <w:t xml:space="preserve"> </w:t>
+      </w:r>
+      <w:r>
+        <w:rPr>
+          <w:i/>
+          <w:iCs/>
+        </w:rPr>
+        <w:t xml:space="preserve">information</w:t>
+      </w:r>
+      <w:r>
+        <w:t xml:space="preserve"> </w:t>
+      </w:r>
+      <w:r>
+        <w:t xml:space="preserve">purchase: 78 % of the lab’s existing top decile already contains Ba, so the model’s strong Ba</w:t>
+      </w:r>
+      <w:r>
+        <w:t xml:space="preserve"> </w:t>
+      </w:r>
+      <w:r>
+        <w:t xml:space="preserve">preference may partly reflect that coverage rather than chemistry. If several Tier-B catalysts</w:t>
+      </w:r>
+      <w:r>
+        <w:t xml:space="preserve"> </w:t>
+      </w:r>
+      <w:r>
+        <w:t xml:space="preserve">outperform their predictions, that tells us something the Tier-A catalysts cannot.</w:t>
+      </w:r>
+    </w:p>
+    <w:p>
+      <w:pPr>
+        <w:pStyle w:val="FirstParagraph"/>
+      </w:pPr>
+      <w:r>
+        <w:t xml:space="preserve">We would of course defer to your judgement on synthesis feasibility, and are happy to reweight the</w:t>
+      </w:r>
+      <w:r>
+        <w:t xml:space="preserve"> </w:t>
+      </w:r>
+      <w:r>
+        <w:t xml:space="preserve">split.</w:t>
+      </w:r>
+    </w:p>
+    <w:bookmarkEnd w:id="44"/>
+    <w:bookmarkStart w:id="45" w:name="relation-to-prior-work"/>
+    <w:p>
+      <w:pPr>
+        <w:pStyle w:val="Heading2"/>
+      </w:pPr>
+      <w:r>
+        <w:t xml:space="preserve">9. Relation to prior work</w:t>
+      </w:r>
+    </w:p>
+    <w:p>
+      <w:pPr>
+        <w:pStyle w:val="FirstParagraph"/>
+      </w:pPr>
+      <w:r>
+        <w:t xml:space="preserve">The mechanism of PFT — using a model’s prediction as an input feature — is</w:t>
+      </w:r>
+      <w:r>
+        <w:t xml:space="preserve"> </w:t>
+      </w:r>
+      <w:r>
+        <w:rPr>
+          <w:b/>
+          <w:bCs/>
+        </w:rPr>
+        <w:t xml:space="preserve">stacked generalisation</w:t>
+      </w:r>
+      <w:r>
+        <w:t xml:space="preserve"> </w:t>
+      </w:r>
+      <w:r>
+        <w:t xml:space="preserve">(Wolpert,</w:t>
+      </w:r>
+      <w:r>
+        <w:t xml:space="preserve"> </w:t>
+      </w:r>
+      <w:r>
+        <w:rPr>
+          <w:i/>
+          <w:iCs/>
+        </w:rPr>
+        <w:t xml:space="preserve">Neural Networks</w:t>
+      </w:r>
+      <w:r>
+        <w:t xml:space="preserve"> </w:t>
+      </w:r>
+      <w:r>
+        <w:t xml:space="preserve">5, 1992, 241–259) applied across distributions.</w:t>
+      </w:r>
+      <w:r>
+        <w:t xml:space="preserve"> </w:t>
+      </w:r>
+      <w:r>
+        <w:t xml:space="preserve">“Prior Feature Transfer”</w:t>
+      </w:r>
+      <w:r>
+        <w:t xml:space="preserve"> </w:t>
+      </w:r>
+      <w:r>
+        <w:t xml:space="preserve">was our internal shorthand, not a standard term, and we note that</w:t>
+      </w:r>
+      <w:r>
+        <w:t xml:space="preserve"> </w:t>
+      </w:r>
+      <w:r>
+        <w:t xml:space="preserve">“feature transfer”</w:t>
+      </w:r>
+      <w:r>
+        <w:t xml:space="preserve"> </w:t>
+      </w:r>
+      <w:r>
+        <w:t xml:space="preserve">usually denotes</w:t>
+      </w:r>
+      <w:r>
+        <w:t xml:space="preserve"> </w:t>
+      </w:r>
+      <w:r>
+        <w:rPr>
+          <w:i/>
+          <w:iCs/>
+        </w:rPr>
+        <w:t xml:space="preserve">representation</w:t>
+      </w:r>
+      <w:r>
+        <w:t xml:space="preserve"> </w:t>
+      </w:r>
+      <w:r>
+        <w:t xml:space="preserve">transfer, which this is not.</w:t>
+      </w:r>
+    </w:p>
+    <w:p>
+      <w:pPr>
+        <w:pStyle w:val="BodyText"/>
+      </w:pPr>
+      <w:r>
+        <w:rPr>
+          <w:b/>
+          <w:bCs/>
+        </w:rPr>
+        <w:t xml:space="preserve">Our corrected understanding of when such a method can help.</w:t>
+      </w:r>
+      <w:r>
+        <w:t xml:space="preserve"> </w:t>
+      </w:r>
+      <w:r>
+        <w:t xml:space="preserve">Because the prior</w:t>
+      </w:r>
+      <w:r>
+        <w:t xml:space="preserve"> </w:t>
+      </w:r>
+      <w:r>
+        <w:rPr>
+          <w:rStyle w:val="VerbatimChar"/>
+        </w:rPr>
+        <w:t xml:space="preserve">p = f(x)</w:t>
+      </w:r>
+      <w:r>
+        <w:t xml:space="preserve"> </w:t>
+      </w:r>
+      <w:r>
+        <w:t xml:space="preserve">is a</w:t>
+      </w:r>
+      <w:r>
+        <w:t xml:space="preserve"> </w:t>
+      </w:r>
+      <w:r>
+        <w:t xml:space="preserve">deterministic function of features the final model already has,</w:t>
+      </w:r>
+      <w:r>
+        <w:t xml:space="preserve"> </w:t>
+      </w:r>
+      <w:r>
+        <w:rPr>
+          <w:rStyle w:val="VerbatimChar"/>
+        </w:rPr>
+        <w:t xml:space="preserve">I(y; x, f(x)) = I(y; x)</w:t>
+      </w:r>
+      <w:r>
+        <w:t xml:space="preserve"> </w:t>
+      </w:r>
+      <w:r>
+        <w:t xml:space="preserve">— it cannot</w:t>
+      </w:r>
+      <w:r>
+        <w:t xml:space="preserve"> </w:t>
+      </w:r>
+      <w:r>
+        <w:t xml:space="preserve">add information. It can only supply an inductive bias, or exploit source data covering regions the</w:t>
+      </w:r>
+      <w:r>
+        <w:t xml:space="preserve"> </w:t>
+      </w:r>
+      <w:r>
+        <w:t xml:space="preserve">target data does not. Our results indicate neither applies here at the scale that matters, for three</w:t>
+      </w:r>
+      <w:r>
+        <w:t xml:space="preserve"> </w:t>
+      </w:r>
+      <w:r>
+        <w:t xml:space="preserve">reasons: ~78.5 % of the literature is out-of-distribution relative to the lab; quantile normalisation</w:t>
+      </w:r>
+      <w:r>
+        <w:t xml:space="preserve"> </w:t>
+      </w:r>
+      <w:r>
+        <w:t xml:space="preserve">aligns marginal but not conditional distributions; and literature yields are measured under each</w:t>
+      </w:r>
+      <w:r>
+        <w:t xml:space="preserve"> </w:t>
+      </w:r>
+      <w:r>
+        <w:t xml:space="preserve">paper’s own conditions, whereas our target is the maximum over a standardised battery — semantically</w:t>
+      </w:r>
+      <w:r>
+        <w:t xml:space="preserve"> </w:t>
+      </w:r>
+      <w:r>
+        <w:t xml:space="preserve">different quantities.</w:t>
+      </w:r>
+      <w:r>
+        <w:t xml:space="preserve"> </w:t>
+      </w:r>
+      <w:r>
+        <w:rPr>
+          <w:b/>
+          <w:bCs/>
+        </w:rPr>
+        <w:t xml:space="preserve">The honest scope statement is that this family of methods is a local-coverage</w:t>
+      </w:r>
+      <w:r>
+        <w:rPr>
+          <w:b/>
+          <w:bCs/>
+        </w:rPr>
+        <w:t xml:space="preserve"> </w:t>
+      </w:r>
+      <w:r>
+        <w:rPr>
+          <w:b/>
+          <w:bCs/>
+        </w:rPr>
+        <w:t xml:space="preserve">tool, not a global-information tool.</w:t>
+      </w:r>
+    </w:p>
+    <w:p>
+      <w:pPr>
+        <w:pStyle w:val="BodyText"/>
+      </w:pPr>
+      <w:r>
+        <w:t xml:space="preserve">Related approaches remain distinct: Δ-machine-learning (Ramakrishnan et al.,</w:t>
+      </w:r>
+      <w:r>
+        <w:t xml:space="preserve"> </w:t>
+      </w:r>
+      <w:r>
+        <w:rPr>
+          <w:i/>
+          <w:iCs/>
+        </w:rPr>
+        <w:t xml:space="preserve">JCTC</w:t>
+      </w:r>
+      <w:r>
+        <w:t xml:space="preserve"> </w:t>
+      </w:r>
+      <w:r>
+        <w:t xml:space="preserve">11, 2015, 2087)</w:t>
+      </w:r>
+      <w:r>
+        <w:t xml:space="preserve"> </w:t>
+      </w:r>
+      <w:r>
+        <w:t xml:space="preserve">adds a source estimate as an additive baseline, inheriting its scale; importance weighting (Huang et</w:t>
+      </w:r>
+      <w:r>
+        <w:t xml:space="preserve"> </w:t>
+      </w:r>
+      <w:r>
+        <w:t xml:space="preserve">al., NIPS 2006; Sugiyama et al.,</w:t>
+      </w:r>
+      <w:r>
+        <w:t xml:space="preserve"> </w:t>
+      </w:r>
+      <w:r>
+        <w:rPr>
+          <w:i/>
+          <w:iCs/>
+        </w:rPr>
+        <w:t xml:space="preserve">JMLR</w:t>
+      </w:r>
+      <w:r>
+        <w:t xml:space="preserve"> </w:t>
+      </w:r>
+      <w:r>
+        <w:t xml:space="preserve">8, 2007) corrects which records are used but keeps source</w:t>
+      </w:r>
+      <w:r>
+        <w:t xml:space="preserve"> </w:t>
+      </w:r>
+      <w:r>
+        <w:t xml:space="preserve">labels in the objective — our DRST and KMM baselines are instances; label-shift correction (Lipton et</w:t>
+      </w:r>
+      <w:r>
+        <w:t xml:space="preserve"> </w:t>
+      </w:r>
+      <w:r>
+        <w:t xml:space="preserve">al., ICML 2018) reweights to correct the label distribution.</w:t>
+      </w:r>
+    </w:p>
+    <w:bookmarkEnd w:id="45"/>
+    <w:bookmarkStart w:id="46" w:name="limitations-and-next-steps"/>
+    <w:p>
+      <w:pPr>
+        <w:pStyle w:val="Heading2"/>
+      </w:pPr>
+      <w:r>
+        <w:t xml:space="preserve">10. Limitations and next steps</w:t>
       </w:r>
     </w:p>
     <w:p>
@@ -3435,7 +3519,7 @@
         <w:pStyle w:val="Compact"/>
         <w:numPr>
           <w:ilvl w:val="0"/>
-          <w:numId w:val="1002"/>
+          <w:numId w:val="1003"/>
         </w:numPr>
       </w:pPr>
       <w:r>
@@ -3443,31 +3527,19 @@
           <w:b/>
           <w:bCs/>
         </w:rPr>
-        <w:t xml:space="preserve">The target carries a measurement-effort confound.</w:t>
-      </w:r>
-      <w:r>
-        <w:t xml:space="preserve"> </w:t>
-      </w:r>
-      <w:r>
-        <w:t xml:space="preserve">47 catalysts have fewer than 20 measurements</w:t>
-      </w:r>
-      <w:r>
-        <w:t xml:space="preserve"> </w:t>
-      </w:r>
-      <w:r>
-        <w:t xml:space="preserve">and systematically low maxima; part is a pure sampling effect, part appears to be deliberate early</w:t>
-      </w:r>
-      <w:r>
-        <w:t xml:space="preserve"> </w:t>
-      </w:r>
-      <w:r>
-        <w:t xml:space="preserve">stopping. Excluding them changes our headline metric by 0.002, so nothing hinges on it — but we</w:t>
-      </w:r>
-      <w:r>
-        <w:t xml:space="preserve"> </w:t>
-      </w:r>
-      <w:r>
-        <w:t xml:space="preserve">would welcome confirmation of which it is.</w:t>
+        <w:t xml:space="preserve">The literature contribution is not demonstrated.</w:t>
+      </w:r>
+      <w:r>
+        <w:t xml:space="preserve"> </w:t>
+      </w:r>
+      <w:r>
+        <w:t xml:space="preserve">Four designs plus a 28-family follow-up all</w:t>
+      </w:r>
+      <w:r>
+        <w:t xml:space="preserve"> </w:t>
+      </w:r>
+      <w:r>
+        <w:t xml:space="preserve">returned null. We report this rather than continue searching for a variant that scores well.</w:t>
       </w:r>
     </w:p>
     <w:p>
@@ -3475,7 +3547,7 @@
         <w:pStyle w:val="Compact"/>
         <w:numPr>
           <w:ilvl w:val="0"/>
-          <w:numId w:val="1002"/>
+          <w:numId w:val="1003"/>
         </w:numPr>
       </w:pPr>
       <w:r>
@@ -3483,25 +3555,19 @@
           <w:b/>
           <w:bCs/>
         </w:rPr>
-        <w:t xml:space="preserve">The unrecorded reaction conditions are the largest single opportunity.</w:t>
-      </w:r>
-      <w:r>
-        <w:t xml:space="preserve"> </w:t>
-      </w:r>
-      <w:r>
-        <w:t xml:space="preserve">If those ~27 variables</w:t>
-      </w:r>
-      <w:r>
-        <w:t xml:space="preserve"> </w:t>
-      </w:r>
-      <w:r>
-        <w:t xml:space="preserve">exist in a retrievable form, the 18.2 % irreducible variance becomes partly learnable and</w:t>
-      </w:r>
-      <w:r>
-        <w:t xml:space="preserve"> </w:t>
-      </w:r>
-      <w:r>
-        <w:t xml:space="preserve">condition-level modelling becomes meaningful.</w:t>
+        <w:t xml:space="preserve">Novel promoter families cannot be priced.</w:t>
+      </w:r>
+      <w:r>
+        <w:t xml:space="preserve"> </w:t>
+      </w:r>
+      <w:r>
+        <w:t xml:space="preserve">This is structural, not a modelling deficiency — but</w:t>
+      </w:r>
+      <w:r>
+        <w:t xml:space="preserve"> </w:t>
+      </w:r>
+      <w:r>
+        <w:t xml:space="preserve">§7 quantifies the data required to remove the limitation.</w:t>
       </w:r>
     </w:p>
     <w:p>
@@ -3509,7 +3575,7 @@
         <w:pStyle w:val="Compact"/>
         <w:numPr>
           <w:ilvl w:val="0"/>
-          <w:numId w:val="1002"/>
+          <w:numId w:val="1003"/>
         </w:numPr>
       </w:pPr>
       <w:r>
@@ -3517,145 +3583,31 @@
           <w:b/>
           <w:bCs/>
         </w:rPr>
-        <w:t xml:space="preserve">Cross-preparation transfer is now measured, and it is where literature data finally helps.</w:t>
-      </w:r>
-      <w:r>
-        <w:t xml:space="preserve"> </w:t>
-      </w:r>
-      <w:r>
-        <w:t xml:space="preserve">Predicting</w:t>
-      </w:r>
-      <w:r>
-        <w:t xml:space="preserve"> </w:t>
-      </w:r>
-      <w:r>
-        <w:rPr>
-          <w:i/>
-          <w:iCs/>
-        </w:rPr>
-        <w:t xml:space="preserve">impregnation</w:t>
-      </w:r>
-      <w:r>
-        <w:t xml:space="preserve"> </w:t>
-      </w:r>
-      <w:r>
-        <w:t xml:space="preserve">literature (different source, same preparation) gives ρ = 0.398; predicting</w:t>
-      </w:r>
-      <w:r>
-        <w:t xml:space="preserve"> </w:t>
-      </w:r>
-      <w:r>
-        <w:rPr>
-          <w:i/>
-          <w:iCs/>
-        </w:rPr>
-        <w:t xml:space="preserve">non-impregnation</w:t>
-      </w:r>
-      <w:r>
-        <w:t xml:space="preserve"> </w:t>
-      </w:r>
-      <w:r>
-        <w:t xml:space="preserve">literature gives ρ = 0.238 — so changing preparation costs a further 0.160. At that</w:t>
-      </w:r>
-      <w:r>
-        <w:t xml:space="preserve"> </w:t>
-      </w:r>
-      <w:r>
-        <w:t xml:space="preserve">range the model is not usable for selection out of preparation: its top-decile picks average 11.35 %</w:t>
-      </w:r>
-      <w:r>
-        <w:t xml:space="preserve"> </w:t>
-      </w:r>
-      <w:r>
-        <w:t xml:space="preserve">true yield against a population mean of 10.33 %, while the genuine top decile averages 21.88 %</w:t>
-      </w:r>
-      <w:r>
-        <w:t xml:space="preserve"> </w:t>
-      </w:r>
-      <w:r>
-        <w:t xml:space="preserve">(enrichment 0.42×, i.e. no better than random).</w:t>
-      </w:r>
-      <w:r>
-        <w:t xml:space="preserve"> </w:t>
-      </w:r>
-      <w:r>
-        <w:rPr>
-          <w:b/>
-          <w:bCs/>
-        </w:rPr>
-        <w:t xml:space="preserve">But adding impregnation literature to training</w:t>
-      </w:r>
-      <w:r>
-        <w:rPr>
-          <w:b/>
-          <w:bCs/>
-        </w:rPr>
-        <w:t xml:space="preserve"> </w:t>
-      </w:r>
-      <w:r>
-        <w:rPr>
-          <w:b/>
-          <w:bCs/>
-        </w:rPr>
-        <w:t xml:space="preserve">raises ρ from 0.238 to 0.388 (+0.150, 5/5 seeds)</w:t>
-      </w:r>
-      <w:r>
-        <w:t xml:space="preserve"> </w:t>
-      </w:r>
-      <w:r>
-        <w:t xml:space="preserve">— the first setting in this study where literature</w:t>
-      </w:r>
-      <w:r>
-        <w:t xml:space="preserve"> </w:t>
-      </w:r>
-      <w:r>
-        <w:t xml:space="preserve">data measurably helps, and consistent with the scope statement in §9: the lab has</w:t>
-      </w:r>
-      <w:r>
-        <w:t xml:space="preserve"> </w:t>
-      </w:r>
-      <w:r>
-        <w:rPr>
-          <w:i/>
-          <w:iCs/>
-        </w:rPr>
-        <w:t xml:space="preserve">no</w:t>
-      </w:r>
-      <w:r>
-        <w:t xml:space="preserve"> </w:t>
-      </w:r>
-      <w:r>
-        <w:t xml:space="preserve">coverage of</w:t>
-      </w:r>
-      <w:r>
-        <w:t xml:space="preserve"> </w:t>
-      </w:r>
-      <w:r>
-        <w:t xml:space="preserve">non-impregnation chemistry, so the literature supplies genuinely new information there. Two caveats:</w:t>
-      </w:r>
-      <w:r>
-        <w:t xml:space="preserve"> </w:t>
-      </w:r>
-      <w:r>
-        <w:t xml:space="preserve">absolute performance remains poor, and plain merging outperforms the prior-feature construction</w:t>
-      </w:r>
-      <w:r>
-        <w:t xml:space="preserve"> </w:t>
-      </w:r>
-      <w:r>
-        <w:t xml:space="preserve">(0.388 vs 0.318). Details in</w:t>
-      </w:r>
-      <w:r>
-        <w:t xml:space="preserve"> </w:t>
-      </w:r>
-      <w:r>
-        <w:rPr>
-          <w:rStyle w:val="VerbatimChar"/>
-        </w:rPr>
-        <w:t xml:space="preserve">phase7_prep_ood.py</w:t>
-      </w:r>
-      <w:r>
-        <w:t xml:space="preserve">; this supersedes the earlier row-level OOD numbers.</w:t>
+        <w:t xml:space="preserve">The target carries a measurement-effort confound.</w:t>
+      </w:r>
+      <w:r>
+        <w:t xml:space="preserve"> </w:t>
+      </w:r>
+      <w:r>
+        <w:t xml:space="preserve">47 catalysts have fewer than 20 measurements</w:t>
+      </w:r>
+      <w:r>
+        <w:t xml:space="preserve"> </w:t>
+      </w:r>
+      <w:r>
+        <w:t xml:space="preserve">and systematically low maxima; part is a pure sampling effect, part appears to be deliberate early</w:t>
+      </w:r>
+      <w:r>
+        <w:t xml:space="preserve"> </w:t>
+      </w:r>
+      <w:r>
+        <w:t xml:space="preserve">stopping. Excluding them changes our headline metric by 0.002, so nothing hinges on it — but we</w:t>
+      </w:r>
+      <w:r>
+        <w:t xml:space="preserve"> </w:t>
+      </w:r>
+      <w:r>
+        <w:t xml:space="preserve">would welcome confirmation of which it is.</w:t>
       </w:r>
     </w:p>
     <w:p>
@@ -3663,7 +3615,195 @@
         <w:pStyle w:val="Compact"/>
         <w:numPr>
           <w:ilvl w:val="0"/>
-          <w:numId w:val="1002"/>
+          <w:numId w:val="1003"/>
+        </w:numPr>
+      </w:pPr>
+      <w:r>
+        <w:rPr>
+          <w:b/>
+          <w:bCs/>
+        </w:rPr>
+        <w:t xml:space="preserve">The unrecorded reaction conditions are the largest single opportunity.</w:t>
+      </w:r>
+      <w:r>
+        <w:t xml:space="preserve"> </w:t>
+      </w:r>
+      <w:r>
+        <w:t xml:space="preserve">If those ~27 variables</w:t>
+      </w:r>
+      <w:r>
+        <w:t xml:space="preserve"> </w:t>
+      </w:r>
+      <w:r>
+        <w:t xml:space="preserve">exist in a retrievable form, the 18.2 % irreducible variance becomes partly learnable and</w:t>
+      </w:r>
+      <w:r>
+        <w:t xml:space="preserve"> </w:t>
+      </w:r>
+      <w:r>
+        <w:t xml:space="preserve">condition-level modelling becomes meaningful.</w:t>
+      </w:r>
+    </w:p>
+    <w:p>
+      <w:pPr>
+        <w:pStyle w:val="Compact"/>
+        <w:numPr>
+          <w:ilvl w:val="0"/>
+          <w:numId w:val="1003"/>
+        </w:numPr>
+      </w:pPr>
+      <w:r>
+        <w:rPr>
+          <w:b/>
+          <w:bCs/>
+        </w:rPr>
+        <w:t xml:space="preserve">Cross-preparation transfer is now measured, and it is where literature data finally helps.</w:t>
+      </w:r>
+      <w:r>
+        <w:t xml:space="preserve"> </w:t>
+      </w:r>
+      <w:r>
+        <w:t xml:space="preserve">Predicting</w:t>
+      </w:r>
+      <w:r>
+        <w:t xml:space="preserve"> </w:t>
+      </w:r>
+      <w:r>
+        <w:rPr>
+          <w:i/>
+          <w:iCs/>
+        </w:rPr>
+        <w:t xml:space="preserve">impregnation</w:t>
+      </w:r>
+      <w:r>
+        <w:t xml:space="preserve"> </w:t>
+      </w:r>
+      <w:r>
+        <w:t xml:space="preserve">literature (different source, same preparation) gives ρ = 0.398; predicting</w:t>
+      </w:r>
+      <w:r>
+        <w:t xml:space="preserve"> </w:t>
+      </w:r>
+      <w:r>
+        <w:rPr>
+          <w:i/>
+          <w:iCs/>
+        </w:rPr>
+        <w:t xml:space="preserve">non-impregnation</w:t>
+      </w:r>
+      <w:r>
+        <w:t xml:space="preserve"> </w:t>
+      </w:r>
+      <w:r>
+        <w:t xml:space="preserve">literature gives ρ = 0.238 — so changing preparation costs a further 0.160. At that</w:t>
+      </w:r>
+      <w:r>
+        <w:t xml:space="preserve"> </w:t>
+      </w:r>
+      <w:r>
+        <w:t xml:space="preserve">range the model is not usable for selection out of preparation: its top-decile picks average 11.35 %</w:t>
+      </w:r>
+      <w:r>
+        <w:t xml:space="preserve"> </w:t>
+      </w:r>
+      <w:r>
+        <w:t xml:space="preserve">true yield against a population mean of 10.33 %, while the genuine top decile averages 21.88 %</w:t>
+      </w:r>
+      <w:r>
+        <w:t xml:space="preserve"> </w:t>
+      </w:r>
+      <w:r>
+        <w:t xml:space="preserve">(enrichment 0.42×, i.e. no better than random).</w:t>
+      </w:r>
+      <w:r>
+        <w:t xml:space="preserve"> </w:t>
+      </w:r>
+      <w:r>
+        <w:rPr>
+          <w:b/>
+          <w:bCs/>
+        </w:rPr>
+        <w:t xml:space="preserve">But adding impregnation literature to training</w:t>
+      </w:r>
+      <w:r>
+        <w:rPr>
+          <w:b/>
+          <w:bCs/>
+        </w:rPr>
+        <w:t xml:space="preserve"> </w:t>
+      </w:r>
+      <w:r>
+        <w:rPr>
+          <w:b/>
+          <w:bCs/>
+        </w:rPr>
+        <w:t xml:space="preserve">raises ρ from 0.238 to 0.388 (+0.150, 5/5 seeds)</w:t>
+      </w:r>
+      <w:r>
+        <w:t xml:space="preserve"> </w:t>
+      </w:r>
+      <w:r>
+        <w:t xml:space="preserve">— the first setting in this study where literature</w:t>
+      </w:r>
+      <w:r>
+        <w:t xml:space="preserve"> </w:t>
+      </w:r>
+      <w:r>
+        <w:t xml:space="preserve">data measurably helps, and consistent with the scope statement in §9: the lab has</w:t>
+      </w:r>
+      <w:r>
+        <w:t xml:space="preserve"> </w:t>
+      </w:r>
+      <w:r>
+        <w:rPr>
+          <w:i/>
+          <w:iCs/>
+        </w:rPr>
+        <w:t xml:space="preserve">no</w:t>
+      </w:r>
+      <w:r>
+        <w:t xml:space="preserve"> </w:t>
+      </w:r>
+      <w:r>
+        <w:t xml:space="preserve">coverage of</w:t>
+      </w:r>
+      <w:r>
+        <w:t xml:space="preserve"> </w:t>
+      </w:r>
+      <w:r>
+        <w:t xml:space="preserve">non-impregnation chemistry, so the literature supplies genuinely new information there. Two caveats:</w:t>
+      </w:r>
+      <w:r>
+        <w:t xml:space="preserve"> </w:t>
+      </w:r>
+      <w:r>
+        <w:t xml:space="preserve">absolute performance remains poor, and plain merging outperforms the prior-feature construction</w:t>
+      </w:r>
+      <w:r>
+        <w:t xml:space="preserve"> </w:t>
+      </w:r>
+      <w:r>
+        <w:t xml:space="preserve">(0.388 vs 0.318). Details in</w:t>
+      </w:r>
+      <w:r>
+        <w:t xml:space="preserve"> </w:t>
+      </w:r>
+      <w:r>
+        <w:rPr>
+          <w:rStyle w:val="VerbatimChar"/>
+        </w:rPr>
+        <w:t xml:space="preserve">phase7_prep_ood.py</w:t>
+      </w:r>
+      <w:r>
+        <w:t xml:space="preserve">; this supersedes the earlier row-level OOD numbers.</w:t>
+      </w:r>
+    </w:p>
+    <w:p>
+      <w:pPr>
+        <w:pStyle w:val="Compact"/>
+        <w:numPr>
+          <w:ilvl w:val="0"/>
+          <w:numId w:val="1003"/>
         </w:numPr>
       </w:pPr>
       <w:r>
@@ -4060,6 +4200,9 @@
     </w:lvlOverride>
   </w:num>
   <w:num w:numId="1002">
+    <w:abstractNumId w:val="991"/>
+  </w:num>
+  <w:num w:numId="1003">
     <w:abstractNumId w:val="991"/>
   </w:num>
 </w:numbering>

</xml_diff>